<commit_message>
added support for cross references
</commit_message>
<xml_diff>
--- a/example/example.docx
+++ b/example/example.docx
@@ -40,10 +40,7 @@
         <w:t>Collaboration-GC</w:t>
       </w:r>
       <w:r>
-        <w:t>”</w:t>
-      </w:r>
-      <w:r>
-        <w:t>) set out the general terms and mechanisms that govern all Collaboration agreements that expressly refer to them. They apply uniformly worldwide, ensuring consistency, legal certainty, and modularity across jurisdictions.</w:t>
+        <w:t>”) set out the general terms and mechanisms that govern all Collaboration agreements that expressly refer to them. They apply uniformly worldwide, ensuring consistency, legal certainty, and modularity across jurisdictions.</w:t>
       </w:r>
     </w:p>
     <w:p>
@@ -65,7 +62,7 @@
       <w:r>
         <w:t>All templates and documents composing the Contract are published and maintained by FlexUp and distributed under the FlexUp Licence (</w:t>
       </w:r>
-      <w:hyperlink r:id="rId7">
+      <w:hyperlink r:id="rId10">
         <w:r>
           <w:rPr>
             <w:rStyle w:val="Hyperlink"/>
@@ -89,9 +86,11 @@
       <w:pPr>
         <w:pStyle w:val="Article2"/>
       </w:pPr>
+      <w:bookmarkStart w:id="2" w:name="_Ref224325700"/>
       <w:r>
         <w:t>The Contract may include the following documents, listed in descending order of priority:</w:t>
       </w:r>
+      <w:bookmarkEnd w:id="2"/>
     </w:p>
     <w:p>
       <w:pPr>
@@ -224,7 +223,28 @@
         <w:pStyle w:val="Article2"/>
       </w:pPr>
       <w:r>
-        <w:t>The Contract is composed of the documents listed in Article 1.1 that are expressly designated as applicable in the Collaboration-SC, together with any additional documents expressly incorporated therein. The applicable documents form an inseparable contractual whole and are collectively referred to as the “</w:t>
+        <w:t xml:space="preserve">The Contract is composed of the documents listed in Article </w:t>
+      </w:r>
+      <w:r>
+        <w:fldChar w:fldCharType="begin"/>
+      </w:r>
+      <w:r>
+        <w:instrText xml:space="preserve"> REF _Ref224325700 \r \h </w:instrText>
+      </w:r>
+      <w:r>
+        <w:fldChar w:fldCharType="separate"/>
+      </w:r>
+      <w:r>
+        <w:t>1.1</w:t>
+      </w:r>
+      <w:r>
+        <w:fldChar w:fldCharType="end"/>
+      </w:r>
+      <w:r>
+        <w:t xml:space="preserve"> </w:t>
+      </w:r>
+      <w:r>
+        <w:t>that are expressly designated as applicable in the Collaboration-SC, together with any additional documents expressly incorporated therein. The applicable documents form an inseparable contractual whole and are collectively referred to as the “</w:t>
       </w:r>
       <w:r>
         <w:rPr>
@@ -250,7 +270,25 @@
         <w:pStyle w:val="Offset"/>
       </w:pPr>
       <w:r>
-        <w:t>In the event of any inconsistency between these documents, the order of priority set out in Article 1.1 shall apply.</w:t>
+        <w:t xml:space="preserve">In the event of any inconsistency between these documents, the order of priority set out in Article </w:t>
+      </w:r>
+      <w:r>
+        <w:fldChar w:fldCharType="begin"/>
+      </w:r>
+      <w:r>
+        <w:instrText xml:space="preserve"> REF _Ref224325700 \r \h </w:instrText>
+      </w:r>
+      <w:r>
+        <w:fldChar w:fldCharType="separate"/>
+      </w:r>
+      <w:r>
+        <w:t>1.1</w:t>
+      </w:r>
+      <w:r>
+        <w:fldChar w:fldCharType="end"/>
+      </w:r>
+      <w:r>
+        <w:t>shall apply.</w:t>
       </w:r>
     </w:p>
     <w:p>
@@ -331,7 +369,7 @@
       <w:r>
         <w:t>For each document composing the General Conditions, the applicable version is the latest version published on the FlexUp website (</w:t>
       </w:r>
-      <w:hyperlink r:id="rId8">
+      <w:hyperlink r:id="rId11">
         <w:r>
           <w:rPr>
             <w:rStyle w:val="Hyperlink"/>
@@ -355,7 +393,7 @@
       <w:r>
         <w:t xml:space="preserve">In this Contract, capitalised words are defined terms, whose definitions are given in this Article or, if not here, elsewhere in the documents composing the Contract or in the FlexUp Glossary (available on </w:t>
       </w:r>
-      <w:hyperlink r:id="rId9">
+      <w:hyperlink r:id="rId12">
         <w:r>
           <w:rPr>
             <w:rStyle w:val="Hyperlink"/>
@@ -591,7 +629,7 @@
                     </pic:cNvPicPr>
                   </pic:nvPicPr>
                   <pic:blipFill>
-                    <a:blip r:embed="rId10"/>
+                    <a:blip r:embed="rId13"/>
                     <a:stretch>
                       <a:fillRect/>
                     </a:stretch>
@@ -648,10 +686,7 @@
         <w:pStyle w:val="Article2"/>
       </w:pPr>
       <w:r>
-        <w:t xml:space="preserve">Without prejudice to Article “Independence and absence of partnership” </w:t>
-      </w:r>
-      <w:r>
-        <w:t>of the FlexUp-GC, the Parties do not owe fiduciary duties to each other unless expressly provided. Each Party contracts with Clients independently in its own name, and no Party has authority to bind, represent, or assume obligations on behalf of the other Party vis-a-vis any Client, unless expressly authorised In Writing for a specific transaction.</w:t>
+        <w:t>Without prejudice to Article “Independence and absence of partnership” of the FlexUp-GC, the Parties do not owe fiduciary duties to each other unless expressly provided. Each Party contracts with Clients independently in its own name, and no Party has authority to bind, represent, or assume obligations on behalf of the other Party vis-a-vis any Client, unless expressly authorised In Writing for a specific transaction.</w:t>
       </w:r>
     </w:p>
     <w:p>
@@ -836,7 +871,7 @@
                     </pic:cNvPicPr>
                   </pic:nvPicPr>
                   <pic:blipFill>
-                    <a:blip r:embed="rId10"/>
+                    <a:blip r:embed="rId13"/>
                     <a:stretch>
                       <a:fillRect/>
                     </a:stretch>
@@ -1256,10 +1291,7 @@
         <w:t>Referral Activity</w:t>
       </w:r>
       <w:r>
-        <w:t xml:space="preserve"> (5%). The Referral Activity consists of introducing a prospective Client to the other Party, where such introduction leads to a first meeting or initial engagement and effective cause of a commercial relationship. The Referral Activity is client-wide: once a Party has referred a Client, the Referral Activity Fee applies to all revenue from that Client for the duration of the Activity Fee Period, regardless of the number or nature of Orders. The detailed mechanics of the Referral Activity are set out in Art</w:t>
-      </w:r>
-      <w:r>
-        <w:t>icle “Referral Activity”.</w:t>
+        <w:t xml:space="preserve"> (5%). The Referral Activity consists of introducing a prospective Client to the other Party, where such introduction leads to a first meeting or initial engagement and effective cause of a commercial relationship. The Referral Activity is client-wide: once a Party has referred a Client, the Referral Activity Fee applies to all revenue from that Client for the duration of the Activity Fee Period, regardless of the number or nature of Orders. The detailed mechanics of the Referral Activity are set out in Article “Referral Activity”.</w:t>
       </w:r>
     </w:p>
     <w:p>
@@ -1274,10 +1306,7 @@
         <w:t>Sales Activity</w:t>
       </w:r>
       <w:r>
-        <w:t xml:space="preserve"> (10%). The Sales Activity consists of conducting the sales process for a specific Order, including qualification of the opportunity, preparation and presentation of the commercial proposal, negotiation of terms, and closing the transaction, provided that such Party plays a material and primary role in closing the transaction. The Sales Activity is order-specific: the Activity Fee applies only to the specific Order that the Performing Party has sold, or in the case of a Recurring-Order contract, for all the</w:t>
-      </w:r>
-      <w:r>
-        <w:t xml:space="preserve"> similar orders in this recurrence. A new Sales Activity may be performed by either Party for subsequent Orders with the same Client, ensuring a continuous incentive to originate new business.</w:t>
+        <w:t xml:space="preserve"> (10%). The Sales Activity consists of conducting the sales process for a specific Order, including qualification of the opportunity, preparation and presentation of the commercial proposal, negotiation of terms, and closing the transaction, provided that such Party plays a material and primary role in closing the transaction. The Sales Activity is order-specific: the Activity Fee applies only to the specific Order that the Performing Party has sold, or in the case of a Recurring-Order contract, for all the similar orders in this recurrence. A new Sales Activity may be performed by either Party for subsequent Orders with the same Client, ensuring a continuous incentive to originate new business.</w:t>
       </w:r>
     </w:p>
     <w:p>
@@ -2279,6 +2308,7 @@
       <w:pPr>
         <w:pStyle w:val="Article2"/>
       </w:pPr>
+      <w:bookmarkStart w:id="3" w:name="_Ref224325732"/>
       <w:r>
         <w:rPr>
           <w:b/>
@@ -2289,6 +2319,7 @@
       <w:r>
         <w:t>. The Collecting Party shall pay each valid invoice by bank transfer to the other Party’s designated bank account. If the invoice is received before the fifteenth (15th) of a given month, payment is due by the last business day of that same month. If the invoice is received after the fifteenth (15th), payment is due by the last business day of the following month. If a due date falls on a non-business day, payment shall be due on the next business day.</w:t>
       </w:r>
+      <w:bookmarkEnd w:id="3"/>
     </w:p>
     <w:p>
       <w:pPr>
@@ -2310,7 +2341,25 @@
         <w:pStyle w:val="Article3"/>
       </w:pPr>
       <w:r>
-        <w:t>the undisputed portion must be paid in accordance with Article 11.3;</w:t>
+        <w:t xml:space="preserve">the undisputed portion must be paid in accordance with Article </w:t>
+      </w:r>
+      <w:r>
+        <w:fldChar w:fldCharType="begin"/>
+      </w:r>
+      <w:r>
+        <w:instrText xml:space="preserve"> REF _Ref224325732 \r \h </w:instrText>
+      </w:r>
+      <w:r>
+        <w:fldChar w:fldCharType="separate"/>
+      </w:r>
+      <w:r>
+        <w:t>11.3</w:t>
+      </w:r>
+      <w:r>
+        <w:fldChar w:fldCharType="end"/>
+      </w:r>
+      <w:r>
+        <w:t>;</w:t>
       </w:r>
     </w:p>
     <w:p>
@@ -2671,7 +2720,7 @@
       <w:bookmarkEnd w:id="1"/>
     </w:p>
     <w:sectPr>
-      <w:footerReference w:type="default" r:id="rId11"/>
+      <w:footerReference w:type="default" r:id="rId14"/>
       <w:type w:val="continuous"/>
       <w:pgSz w:w="11906" w:h="16838" w:code="9"/>
       <w:pgMar w:top="851" w:right="851" w:bottom="851" w:left="851" w:header="425" w:footer="425" w:gutter="0"/>
@@ -4940,6 +4989,26 @@
 </file>
 
 <file path=customXml/item1.xml><?xml version="1.0" encoding="utf-8"?>
+<p:properties xmlns:p="http://schemas.microsoft.com/office/2006/metadata/properties" xmlns:xsi="http://www.w3.org/2001/XMLSchema-instance" xmlns:pc="http://schemas.microsoft.com/office/infopath/2007/PartnerControls">
+  <documentManagement>
+    <lcf76f155ced4ddcb4097134ff3c332f xmlns="c94c4ac8-faf4-477a-b4e6-6adaeda6e30a">
+      <Terms xmlns="http://schemas.microsoft.com/office/infopath/2007/PartnerControls"/>
+    </lcf76f155ced4ddcb4097134ff3c332f>
+    <TaxCatchAll xmlns="585e1850-a672-4c59-9766-e6f9b47acd25" xsi:nil="true"/>
+  </documentManagement>
+</p:properties>
+</file>
+
+<file path=customXml/item2.xml><?xml version="1.0" encoding="utf-8"?>
+<?mso-contentType ?>
+<FormTemplates xmlns="http://schemas.microsoft.com/sharepoint/v3/contenttype/forms">
+  <Display>DocumentLibraryForm</Display>
+  <Edit>DocumentLibraryForm</Edit>
+  <New>DocumentLibraryForm</New>
+</FormTemplates>
+</file>
+
+<file path=customXml/item3.xml><?xml version="1.0" encoding="utf-8"?>
 <ct:contentTypeSchema xmlns:ct="http://schemas.microsoft.com/office/2006/metadata/contentType" xmlns:ma="http://schemas.microsoft.com/office/2006/metadata/properties/metaAttributes" ct:_="" ma:_="" ma:contentTypeName="Document" ma:contentTypeID="0x010100D6773F011C44794EBD166792D78297B2" ma:contentTypeVersion="11" ma:contentTypeDescription="Create a new document." ma:contentTypeScope="" ma:versionID="3820cfa27876710366705819bfadb0e3">
   <xsd:schema xmlns:xsd="http://www.w3.org/2001/XMLSchema" xmlns:xs="http://www.w3.org/2001/XMLSchema" xmlns:p="http://schemas.microsoft.com/office/2006/metadata/properties" xmlns:ns2="c94c4ac8-faf4-477a-b4e6-6adaeda6e30a" xmlns:ns3="585e1850-a672-4c59-9766-e6f9b47acd25" targetNamespace="http://schemas.microsoft.com/office/2006/metadata/properties" ma:root="true" ma:fieldsID="499fff40122d1a2e24091cbf6e45c141" ns2:_="" ns3:_="">
     <xsd:import namespace="c94c4ac8-faf4-477a-b4e6-6adaeda6e30a"/>
@@ -5134,34 +5203,40 @@
 </ct:contentTypeSchema>
 </file>
 
-<file path=customXml/item2.xml><?xml version="1.0" encoding="utf-8"?>
-<?mso-contentType ?>
-<FormTemplates xmlns="http://schemas.microsoft.com/sharepoint/v3/contenttype/forms">
-  <Display>DocumentLibraryForm</Display>
-  <Edit>DocumentLibraryForm</Edit>
-  <New>DocumentLibraryForm</New>
-</FormTemplates>
-</file>
-
-<file path=customXml/item3.xml><?xml version="1.0" encoding="utf-8"?>
-<p:properties xmlns:p="http://schemas.microsoft.com/office/2006/metadata/properties" xmlns:xsi="http://www.w3.org/2001/XMLSchema-instance" xmlns:pc="http://schemas.microsoft.com/office/infopath/2007/PartnerControls">
-  <documentManagement>
-    <lcf76f155ced4ddcb4097134ff3c332f xmlns="c94c4ac8-faf4-477a-b4e6-6adaeda6e30a">
-      <Terms xmlns="http://schemas.microsoft.com/office/infopath/2007/PartnerControls"/>
-    </lcf76f155ced4ddcb4097134ff3c332f>
-    <TaxCatchAll xmlns="585e1850-a672-4c59-9766-e6f9b47acd25" xsi:nil="true"/>
-  </documentManagement>
-</p:properties>
-</file>
-
 <file path=customXml/itemProps1.xml><?xml version="1.0" encoding="utf-8"?>
-<ds:datastoreItem xmlns:ds="http://schemas.openxmlformats.org/officeDocument/2006/customXml" ds:itemID="{687EC881-F6DC-46A4-BB36-3DD21702ECBD}"/>
+<ds:datastoreItem xmlns:ds="http://schemas.openxmlformats.org/officeDocument/2006/customXml" ds:itemID="{C5E13871-0CB3-453C-92F4-2773C880F070}">
+  <ds:schemaRefs>
+    <ds:schemaRef ds:uri="http://schemas.microsoft.com/office/2006/metadata/properties"/>
+    <ds:schemaRef ds:uri="http://schemas.microsoft.com/office/infopath/2007/PartnerControls"/>
+    <ds:schemaRef ds:uri="c94c4ac8-faf4-477a-b4e6-6adaeda6e30a"/>
+    <ds:schemaRef ds:uri="585e1850-a672-4c59-9766-e6f9b47acd25"/>
+  </ds:schemaRefs>
+</ds:datastoreItem>
 </file>
 
 <file path=customXml/itemProps2.xml><?xml version="1.0" encoding="utf-8"?>
-<ds:datastoreItem xmlns:ds="http://schemas.openxmlformats.org/officeDocument/2006/customXml" ds:itemID="{B116A0BD-70B6-4DB0-B963-90204AAE73E0}"/>
+<ds:datastoreItem xmlns:ds="http://schemas.openxmlformats.org/officeDocument/2006/customXml" ds:itemID="{B116A0BD-70B6-4DB0-B963-90204AAE73E0}">
+  <ds:schemaRefs>
+    <ds:schemaRef ds:uri="http://schemas.microsoft.com/sharepoint/v3/contenttype/forms"/>
+  </ds:schemaRefs>
+</ds:datastoreItem>
 </file>
 
 <file path=customXml/itemProps3.xml><?xml version="1.0" encoding="utf-8"?>
-<ds:datastoreItem xmlns:ds="http://schemas.openxmlformats.org/officeDocument/2006/customXml" ds:itemID="{C5E13871-0CB3-453C-92F4-2773C880F070}"/>
+<ds:datastoreItem xmlns:ds="http://schemas.openxmlformats.org/officeDocument/2006/customXml" ds:itemID="{687EC881-F6DC-46A4-BB36-3DD21702ECBD}">
+  <ds:schemaRefs>
+    <ds:schemaRef ds:uri="http://schemas.microsoft.com/office/2006/metadata/contentType"/>
+    <ds:schemaRef ds:uri="http://schemas.microsoft.com/office/2006/metadata/properties/metaAttributes"/>
+    <ds:schemaRef ds:uri="http://www.w3.org/2001/XMLSchema"/>
+    <ds:schemaRef ds:uri="http://schemas.microsoft.com/office/2006/metadata/properties"/>
+    <ds:schemaRef ds:uri="c94c4ac8-faf4-477a-b4e6-6adaeda6e30a"/>
+    <ds:schemaRef ds:uri="585e1850-a672-4c59-9766-e6f9b47acd25"/>
+    <ds:schemaRef ds:uri="http://schemas.microsoft.com/office/2006/documentManagement/types"/>
+    <ds:schemaRef ds:uri="http://schemas.microsoft.com/office/infopath/2007/PartnerControls"/>
+    <ds:schemaRef ds:uri="http://schemas.openxmlformats.org/package/2006/metadata/core-properties"/>
+    <ds:schemaRef ds:uri="http://purl.org/dc/elements/1.1/"/>
+    <ds:schemaRef ds:uri="http://purl.org/dc/terms/"/>
+    <ds:schemaRef ds:uri="http://schemas.microsoft.com/internal/obd"/>
+  </ds:schemaRefs>
+</ds:datastoreItem>
 </file>
</xml_diff>